<commit_message>
Update Buoi03_Architecture Styles (Layered, Microkernel).docx
</commit_message>
<xml_diff>
--- a/Tuan03/Buoi03_Architecture Styles (Layered, Microkernel).docx
+++ b/Tuan03/Buoi03_Architecture Styles (Layered, Microkernel).docx
@@ -1,6 +1,6 @@
 
 <file path=word/document.xml><?xml version="1.0" encoding="utf-8"?>
-<w:document xmlns:wpc="http://schemas.microsoft.com/office/word/2010/wordprocessingCanvas" xmlns:mc="http://schemas.openxmlformats.org/markup-compatibility/2006" xmlns:o="urn:schemas-microsoft-com:office:office" xmlns:r="http://schemas.openxmlformats.org/officeDocument/2006/relationships" xmlns:m="http://schemas.openxmlformats.org/officeDocument/2006/math" xmlns:v="urn:schemas-microsoft-com:vml" xmlns:wp14="http://schemas.microsoft.com/office/word/2010/wordprocessingDrawing" xmlns:wp="http://schemas.openxmlformats.org/drawingml/2006/wordprocessingDrawing" xmlns:w10="urn:schemas-microsoft-com:office:word" xmlns:w="http://schemas.openxmlformats.org/wordprocessingml/2006/main" xmlns:w14="http://schemas.microsoft.com/office/word/2010/wordml" xmlns:w15="http://schemas.microsoft.com/office/word/2012/wordml" xmlns:wpg="http://schemas.microsoft.com/office/word/2010/wordprocessingGroup" xmlns:wpi="http://schemas.microsoft.com/office/word/2010/wordprocessingInk" xmlns:wne="http://schemas.microsoft.com/office/word/2006/wordml" xmlns:wps="http://schemas.microsoft.com/office/word/2010/wordprocessingShape" mc:Ignorable="w14 w15 wp14">
+<w:document xmlns:wpc="http://schemas.microsoft.com/office/word/2010/wordprocessingCanvas" xmlns:cx="http://schemas.microsoft.com/office/drawing/2014/chartex" xmlns:cx1="http://schemas.microsoft.com/office/drawing/2015/9/8/chartex" xmlns:cx2="http://schemas.microsoft.com/office/drawing/2015/10/21/chartex" xmlns:cx3="http://schemas.microsoft.com/office/drawing/2016/5/9/chartex" xmlns:cx4="http://schemas.microsoft.com/office/drawing/2016/5/10/chartex" xmlns:cx5="http://schemas.microsoft.com/office/drawing/2016/5/11/chartex" xmlns:cx6="http://schemas.microsoft.com/office/drawing/2016/5/12/chartex" xmlns:cx7="http://schemas.microsoft.com/office/drawing/2016/5/13/chartex" xmlns:cx8="http://schemas.microsoft.com/office/drawing/2016/5/14/chartex" xmlns:mc="http://schemas.openxmlformats.org/markup-compatibility/2006" xmlns:aink="http://schemas.microsoft.com/office/drawing/2016/ink" xmlns:am3d="http://schemas.microsoft.com/office/drawing/2017/model3d" xmlns:o="urn:schemas-microsoft-com:office:office" xmlns:oel="http://schemas.microsoft.com/office/2019/extlst" xmlns:r="http://schemas.openxmlformats.org/officeDocument/2006/relationships" xmlns:m="http://schemas.openxmlformats.org/officeDocument/2006/math" xmlns:v="urn:schemas-microsoft-com:vml" xmlns:wp14="http://schemas.microsoft.com/office/word/2010/wordprocessingDrawing" xmlns:wp="http://schemas.openxmlformats.org/drawingml/2006/wordprocessingDrawing" xmlns:w10="urn:schemas-microsoft-com:office:word" xmlns:w="http://schemas.openxmlformats.org/wordprocessingml/2006/main" xmlns:w14="http://schemas.microsoft.com/office/word/2010/wordml" xmlns:w15="http://schemas.microsoft.com/office/word/2012/wordml" xmlns:w16cex="http://schemas.microsoft.com/office/word/2018/wordml/cex" xmlns:w16cid="http://schemas.microsoft.com/office/word/2016/wordml/cid" xmlns:w16="http://schemas.microsoft.com/office/word/2018/wordml" xmlns:w16du="http://schemas.microsoft.com/office/word/2023/wordml/word16du" xmlns:w16sdtdh="http://schemas.microsoft.com/office/word/2020/wordml/sdtdatahash" xmlns:w16sdtfl="http://schemas.microsoft.com/office/word/2024/wordml/sdtformatlock" xmlns:w16se="http://schemas.microsoft.com/office/word/2015/wordml/symex" xmlns:wpg="http://schemas.microsoft.com/office/word/2010/wordprocessingGroup" xmlns:wpi="http://schemas.microsoft.com/office/word/2010/wordprocessingInk" xmlns:wne="http://schemas.microsoft.com/office/word/2006/wordml" xmlns:wps="http://schemas.microsoft.com/office/word/2010/wordprocessingShape" mc:Ignorable="w14 w15 w16se w16cid w16 w16cex w16sdtdh w16sdtfl w16du wp14">
   <w:body>
     <w:p>
       <w:pPr>
@@ -129,14 +129,21 @@
           <w:numId w:val="2"/>
         </w:numPr>
         <w:spacing w:line="360" w:lineRule="auto"/>
+        <w:rPr>
+          <w:lang w:val="fr-FR"/>
+        </w:rPr>
       </w:pPr>
       <w:r>
         <w:rPr>
           <w:rStyle w:val="Strong"/>
+          <w:lang w:val="fr-FR"/>
         </w:rPr>
         <w:t>Content Management</w:t>
       </w:r>
       <w:r>
+        <w:rPr>
+          <w:lang w:val="fr-FR"/>
+        </w:rPr>
         <w:t xml:space="preserve"> (quản lý bài viết/trang)</w:t>
       </w:r>
     </w:p>
@@ -204,67 +211,68 @@
     </w:p>
     <w:p>
       <w:pPr>
-        <w:spacing w:before="240" w:after="0" w:line="360" w:lineRule="auto"/>
+        <w:spacing w:after="0" w:line="240" w:lineRule="auto"/>
         <w:jc w:val="center"/>
-        <w:textAlignment w:val="baseline"/>
         <w:rPr>
           <w:rFonts w:ascii="Times New Roman" w:eastAsia="Times New Roman" w:hAnsi="Times New Roman" w:cs="Times New Roman"/>
-          <w:color w:val="000000"/>
-          <w:sz w:val="30"/>
-          <w:szCs w:val="30"/>
-        </w:rPr>
-      </w:pPr>
-      <w:r>
-        <w:rPr>
-          <w:rFonts w:ascii="Times New Roman" w:eastAsia="Times New Roman" w:hAnsi="Times New Roman" w:cs="Times New Roman"/>
-          <w:color w:val="000000"/>
-          <w:sz w:val="30"/>
-          <w:szCs w:val="30"/>
-        </w:rPr>
-        <w:pict>
-          <v:shapetype id="_x0000_t75" coordsize="21600,21600" o:spt="75" o:preferrelative="t" path="m@4@5l@4@11@9@11@9@5xe" filled="f" stroked="f">
-            <v:stroke joinstyle="miter"/>
-            <v:formulas>
-              <v:f eqn="if lineDrawn pixelLineWidth 0"/>
-              <v:f eqn="sum @0 1 0"/>
-              <v:f eqn="sum 0 0 @1"/>
-              <v:f eqn="prod @2 1 2"/>
-              <v:f eqn="prod @3 21600 pixelWidth"/>
-              <v:f eqn="prod @3 21600 pixelHeight"/>
-              <v:f eqn="sum @0 0 1"/>
-              <v:f eqn="prod @6 1 2"/>
-              <v:f eqn="prod @7 21600 pixelWidth"/>
-              <v:f eqn="sum @8 21600 0"/>
-              <v:f eqn="prod @7 21600 pixelHeight"/>
-              <v:f eqn="sum @10 21600 0"/>
-            </v:formulas>
-            <v:path o:extrusionok="f" gradientshapeok="t" o:connecttype="rect"/>
-            <o:lock v:ext="edit" aspectratio="t"/>
-          </v:shapetype>
-          <v:shape id="_x0000_i1025" type="#_x0000_t75" style="width:467.7pt;height:226.95pt">
-            <v:imagedata r:id="rId6" o:title="layered"/>
-          </v:shape>
-        </w:pict>
-      </w:r>
-    </w:p>
-    <w:p>
-      <w:pPr>
-        <w:spacing w:line="360" w:lineRule="auto"/>
-        <w:rPr>
-          <w:rFonts w:ascii="Times New Roman" w:eastAsia="Times New Roman" w:hAnsi="Times New Roman" w:cs="Times New Roman"/>
-          <w:color w:val="000000"/>
-          <w:sz w:val="30"/>
-          <w:szCs w:val="30"/>
-        </w:rPr>
-      </w:pPr>
-      <w:r>
-        <w:rPr>
-          <w:rFonts w:ascii="Times New Roman" w:eastAsia="Times New Roman" w:hAnsi="Times New Roman" w:cs="Times New Roman"/>
-          <w:color w:val="000000"/>
-          <w:sz w:val="30"/>
-          <w:szCs w:val="30"/>
-        </w:rPr>
-        <w:br w:type="page"/>
+          <w:sz w:val="24"/>
+          <w:szCs w:val="24"/>
+          <w:lang w:val="vi-VN" w:eastAsia="vi-VN"/>
+        </w:rPr>
+      </w:pPr>
+      <w:r>
+        <w:rPr>
+          <w:noProof/>
+          <w:lang w:val="vi-VN" w:eastAsia="vi-VN"/>
+        </w:rPr>
+        <w:drawing>
+          <wp:inline distT="0" distB="0" distL="0" distR="0" wp14:anchorId="7D5344ED" wp14:editId="65601FF8">
+            <wp:extent cx="1728665" cy="4229100"/>
+            <wp:effectExtent l="0" t="0" r="5080" b="0"/>
+            <wp:docPr id="939169909" name="Picture 4"/>
+            <wp:cNvGraphicFramePr>
+              <a:graphicFrameLocks xmlns:a="http://schemas.openxmlformats.org/drawingml/2006/main" noChangeAspect="1"/>
+            </wp:cNvGraphicFramePr>
+            <a:graphic xmlns:a="http://schemas.openxmlformats.org/drawingml/2006/main">
+              <a:graphicData uri="http://schemas.openxmlformats.org/drawingml/2006/picture">
+                <pic:pic xmlns:pic="http://schemas.openxmlformats.org/drawingml/2006/picture">
+                  <pic:nvPicPr>
+                    <pic:cNvPr id="0" name="Picture 17"/>
+                    <pic:cNvPicPr>
+                      <a:picLocks noChangeAspect="1" noChangeArrowheads="1"/>
+                    </pic:cNvPicPr>
+                  </pic:nvPicPr>
+                  <pic:blipFill>
+                    <a:blip r:embed="rId6">
+                      <a:extLst>
+                        <a:ext uri="{28A0092B-C50C-407E-A947-70E740481C1C}">
+                          <a14:useLocalDpi xmlns:a14="http://schemas.microsoft.com/office/drawing/2010/main" val="0"/>
+                        </a:ext>
+                      </a:extLst>
+                    </a:blip>
+                    <a:srcRect/>
+                    <a:stretch>
+                      <a:fillRect/>
+                    </a:stretch>
+                  </pic:blipFill>
+                  <pic:spPr bwMode="auto">
+                    <a:xfrm>
+                      <a:off x="0" y="0"/>
+                      <a:ext cx="1742780" cy="4263631"/>
+                    </a:xfrm>
+                    <a:prstGeom prst="rect">
+                      <a:avLst/>
+                    </a:prstGeom>
+                    <a:noFill/>
+                    <a:ln>
+                      <a:noFill/>
+                    </a:ln>
+                  </pic:spPr>
+                </pic:pic>
+              </a:graphicData>
+            </a:graphic>
+          </wp:inline>
+        </w:drawing>
       </w:r>
     </w:p>
     <w:p>
@@ -303,28 +311,68 @@
     </w:p>
     <w:p>
       <w:pPr>
-        <w:spacing w:after="0" w:line="360" w:lineRule="auto"/>
+        <w:spacing w:after="0" w:line="240" w:lineRule="auto"/>
         <w:jc w:val="center"/>
-        <w:textAlignment w:val="baseline"/>
         <w:rPr>
           <w:rFonts w:ascii="Times New Roman" w:eastAsia="Times New Roman" w:hAnsi="Times New Roman" w:cs="Times New Roman"/>
-          <w:color w:val="000000"/>
-          <w:sz w:val="30"/>
-          <w:szCs w:val="30"/>
-        </w:rPr>
-      </w:pPr>
-      <w:r>
-        <w:rPr>
-          <w:rFonts w:ascii="Times New Roman" w:eastAsia="Times New Roman" w:hAnsi="Times New Roman" w:cs="Times New Roman"/>
-          <w:color w:val="000000"/>
-          <w:sz w:val="30"/>
-          <w:szCs w:val="30"/>
-        </w:rPr>
-        <w:pict>
-          <v:shape id="_x0000_i1026" type="#_x0000_t75" style="width:467.7pt;height:500.55pt">
-            <v:imagedata r:id="rId7" o:title="microkenel"/>
-          </v:shape>
-        </w:pict>
+          <w:sz w:val="24"/>
+          <w:szCs w:val="24"/>
+          <w:lang w:val="vi-VN" w:eastAsia="vi-VN"/>
+        </w:rPr>
+      </w:pPr>
+      <w:r>
+        <w:rPr>
+          <w:noProof/>
+          <w:lang w:val="vi-VN" w:eastAsia="vi-VN"/>
+        </w:rPr>
+        <w:drawing>
+          <wp:inline distT="0" distB="0" distL="0" distR="0" wp14:anchorId="0CC0D080" wp14:editId="59D7F61E">
+            <wp:extent cx="4171170" cy="7802880"/>
+            <wp:effectExtent l="0" t="0" r="1270" b="7620"/>
+            <wp:docPr id="434162511" name="Picture 5"/>
+            <wp:cNvGraphicFramePr>
+              <a:graphicFrameLocks xmlns:a="http://schemas.openxmlformats.org/drawingml/2006/main" noChangeAspect="1"/>
+            </wp:cNvGraphicFramePr>
+            <a:graphic xmlns:a="http://schemas.openxmlformats.org/drawingml/2006/main">
+              <a:graphicData uri="http://schemas.openxmlformats.org/drawingml/2006/picture">
+                <pic:pic xmlns:pic="http://schemas.openxmlformats.org/drawingml/2006/picture">
+                  <pic:nvPicPr>
+                    <pic:cNvPr id="0" name="Picture 19"/>
+                    <pic:cNvPicPr>
+                      <a:picLocks noChangeAspect="1" noChangeArrowheads="1"/>
+                    </pic:cNvPicPr>
+                  </pic:nvPicPr>
+                  <pic:blipFill>
+                    <a:blip r:embed="rId7">
+                      <a:extLst>
+                        <a:ext uri="{28A0092B-C50C-407E-A947-70E740481C1C}">
+                          <a14:useLocalDpi xmlns:a14="http://schemas.microsoft.com/office/drawing/2010/main" val="0"/>
+                        </a:ext>
+                      </a:extLst>
+                    </a:blip>
+                    <a:srcRect/>
+                    <a:stretch>
+                      <a:fillRect/>
+                    </a:stretch>
+                  </pic:blipFill>
+                  <pic:spPr bwMode="auto">
+                    <a:xfrm>
+                      <a:off x="0" y="0"/>
+                      <a:ext cx="4188173" cy="7834687"/>
+                    </a:xfrm>
+                    <a:prstGeom prst="rect">
+                      <a:avLst/>
+                    </a:prstGeom>
+                    <a:noFill/>
+                    <a:ln>
+                      <a:noFill/>
+                    </a:ln>
+                  </pic:spPr>
+                </pic:pic>
+              </a:graphicData>
+            </a:graphic>
+          </wp:inline>
+        </w:drawing>
       </w:r>
     </w:p>
     <w:p>
@@ -339,6 +387,7 @@
           <w:color w:val="000000"/>
           <w:sz w:val="30"/>
           <w:szCs w:val="30"/>
+          <w:lang w:val="vi-VN"/>
         </w:rPr>
       </w:pPr>
       <w:r>
@@ -347,8 +396,10 @@
           <w:color w:val="000000"/>
           <w:sz w:val="30"/>
           <w:szCs w:val="30"/>
-        </w:rPr>
-        <w:t>So sá</w:t>
+          <w:lang w:val="vi-VN"/>
+        </w:rPr>
+        <w:lastRenderedPageBreak/>
+        <w:t xml:space="preserve">So sánh ưu/nhược điểm </w:t>
       </w:r>
       <w:r>
         <w:rPr>
@@ -356,8 +407,29 @@
           <w:color w:val="000000"/>
           <w:sz w:val="30"/>
           <w:szCs w:val="30"/>
-        </w:rPr>
-        <w:t>nh ưu/nhược điểm dựa trên sách.</w:t>
+          <w:lang w:val="vi-VN"/>
+        </w:rPr>
+        <w:t>của</w:t>
+      </w:r>
+      <w:r>
+        <w:rPr>
+          <w:b w:val="0"/>
+          <w:color w:val="000000"/>
+          <w:sz w:val="30"/>
+          <w:szCs w:val="30"/>
+          <w:lang w:val="vi-VN"/>
+        </w:rPr>
+        <w:t xml:space="preserve"> 2 kiến trúc trên</w:t>
+      </w:r>
+      <w:r>
+        <w:rPr>
+          <w:b w:val="0"/>
+          <w:color w:val="000000"/>
+          <w:sz w:val="30"/>
+          <w:szCs w:val="30"/>
+          <w:lang w:val="vi-VN"/>
+        </w:rPr>
+        <w:t>.</w:t>
       </w:r>
     </w:p>
     <w:tbl>
@@ -503,19 +575,7 @@
                 <w:sz w:val="26"/>
                 <w:szCs w:val="26"/>
               </w:rPr>
-              <w:t>Structu</w:t>
-            </w:r>
-            <w:bookmarkStart w:id="0" w:name="_GoBack"/>
-            <w:bookmarkEnd w:id="0"/>
-            <w:r>
-              <w:rPr>
-                <w:rFonts w:ascii="Times New Roman" w:eastAsia="Times New Roman" w:hAnsi="Times New Roman" w:cs="Times New Roman"/>
-                <w:b/>
-                <w:bCs/>
-                <w:sz w:val="26"/>
-                <w:szCs w:val="26"/>
-              </w:rPr>
-              <w:t>re</w:t>
+              <w:t>Structure</w:t>
             </w:r>
           </w:p>
         </w:tc>
@@ -594,7 +654,6 @@
                 <w:sz w:val="26"/>
                 <w:szCs w:val="26"/>
               </w:rPr>
-              <w:lastRenderedPageBreak/>
               <w:t>Mở rộng tính năng</w:t>
             </w:r>
           </w:p>
@@ -620,7 +679,15 @@
                 <w:sz w:val="26"/>
                 <w:szCs w:val="26"/>
               </w:rPr>
-              <w:t>Khó hơn</w:t>
+              <w:t>M</w:t>
+            </w:r>
+            <w:r>
+              <w:rPr>
+                <w:rFonts w:ascii="Times New Roman" w:eastAsia="Times New Roman" w:hAnsi="Times New Roman" w:cs="Times New Roman"/>
+                <w:sz w:val="26"/>
+                <w:szCs w:val="26"/>
+              </w:rPr>
+              <w:t>ở rộng tốt với chức năng business thông thường, nhưng kém phù hợp với plugin-based extensibility</w:t>
             </w:r>
           </w:p>
         </w:tc>
@@ -645,7 +712,15 @@
                 <w:sz w:val="26"/>
                 <w:szCs w:val="26"/>
               </w:rPr>
-              <w:t>Rất dễ</w:t>
+              <w:t>R</w:t>
+            </w:r>
+            <w:r>
+              <w:rPr>
+                <w:rFonts w:ascii="Times New Roman" w:eastAsia="Times New Roman" w:hAnsi="Times New Roman" w:cs="Times New Roman"/>
+                <w:sz w:val="26"/>
+                <w:szCs w:val="26"/>
+              </w:rPr>
+              <w:t>ất phù hợp cho mở rộng dạng plugin/module độc lập</w:t>
             </w:r>
           </w:p>
         </w:tc>
@@ -691,6 +766,7 @@
                 <w:rFonts w:ascii="Times New Roman" w:eastAsia="Times New Roman" w:hAnsi="Times New Roman" w:cs="Times New Roman"/>
                 <w:sz w:val="26"/>
                 <w:szCs w:val="26"/>
+                <w:lang w:val="vi-VN"/>
               </w:rPr>
             </w:pPr>
             <w:r>
@@ -699,7 +775,32 @@
                 <w:sz w:val="26"/>
                 <w:szCs w:val="26"/>
               </w:rPr>
-              <w:t>Dễ hiểu</w:t>
+              <w:t xml:space="preserve">Dễ </w:t>
+            </w:r>
+            <w:r>
+              <w:rPr>
+                <w:rFonts w:ascii="Times New Roman" w:eastAsia="Times New Roman" w:hAnsi="Times New Roman" w:cs="Times New Roman"/>
+                <w:sz w:val="26"/>
+                <w:szCs w:val="26"/>
+              </w:rPr>
+              <w:t>hiểu</w:t>
+            </w:r>
+            <w:r>
+              <w:rPr>
+                <w:rFonts w:ascii="Times New Roman" w:eastAsia="Times New Roman" w:hAnsi="Times New Roman" w:cs="Times New Roman"/>
+                <w:sz w:val="26"/>
+                <w:szCs w:val="26"/>
+                <w:lang w:val="vi-VN"/>
+              </w:rPr>
+              <w:t xml:space="preserve"> </w:t>
+            </w:r>
+            <w:r>
+              <w:rPr>
+                <w:rFonts w:ascii="Times New Roman" w:eastAsia="Times New Roman" w:hAnsi="Times New Roman" w:cs="Times New Roman"/>
+                <w:sz w:val="26"/>
+                <w:szCs w:val="26"/>
+              </w:rPr>
+              <w:t>và dễ maintain hơn ở giai đoạn đầu</w:t>
             </w:r>
           </w:p>
         </w:tc>
@@ -716,6 +817,7 @@
                 <w:rFonts w:ascii="Times New Roman" w:eastAsia="Times New Roman" w:hAnsi="Times New Roman" w:cs="Times New Roman"/>
                 <w:sz w:val="26"/>
                 <w:szCs w:val="26"/>
+                <w:lang w:val="vi-VN"/>
               </w:rPr>
             </w:pPr>
             <w:r>
@@ -723,8 +825,18 @@
                 <w:rFonts w:ascii="Times New Roman" w:eastAsia="Times New Roman" w:hAnsi="Times New Roman" w:cs="Times New Roman"/>
                 <w:sz w:val="26"/>
                 <w:szCs w:val="26"/>
+                <w:lang w:val="vi-VN"/>
               </w:rPr>
-              <w:t>Phức tạp hơn</w:t>
+              <w:t>M</w:t>
+            </w:r>
+            <w:r>
+              <w:rPr>
+                <w:rFonts w:ascii="Times New Roman" w:eastAsia="Times New Roman" w:hAnsi="Times New Roman" w:cs="Times New Roman"/>
+                <w:sz w:val="26"/>
+                <w:szCs w:val="26"/>
+                <w:lang w:val="vi-VN"/>
+              </w:rPr>
+              <w:t>aintain tốt khi kiến trúc plugin được chuẩn hóa, nhưng phức tạp hơn để thiết kế và vận hành</w:t>
             </w:r>
           </w:p>
         </w:tc>
@@ -778,7 +890,7 @@
                 <w:sz w:val="26"/>
                 <w:szCs w:val="26"/>
               </w:rPr>
-              <w:t>Coupling theo tầng</w:t>
+              <w:t>Nếu phụ thuộc giữa các tầng không được kiểm soát tốt, thay đổi tầng dưới có thể lan ảnh hưởng lên tầng trên.</w:t>
             </w:r>
           </w:p>
         </w:tc>
@@ -1315,6 +1427,7 @@
           <w:rStyle w:val="Strong"/>
           <w:b w:val="0"/>
         </w:rPr>
+        <w:lastRenderedPageBreak/>
         <w:t>Ưu điểm</w:t>
       </w:r>
       <w:r>
@@ -1484,22 +1597,57 @@
     </w:p>
     <w:p>
       <w:pPr>
-        <w:rPr>
-          <w:rFonts w:ascii="Times New Roman" w:eastAsia="Times New Roman" w:hAnsi="Times New Roman" w:cs="Times New Roman"/>
-          <w:bCs/>
-          <w:color w:val="000000"/>
-          <w:sz w:val="30"/>
-          <w:szCs w:val="30"/>
-        </w:rPr>
-      </w:pPr>
-      <w:r>
-        <w:rPr>
-          <w:b/>
-          <w:color w:val="000000"/>
-          <w:sz w:val="30"/>
-          <w:szCs w:val="30"/>
-        </w:rPr>
-        <w:br w:type="page"/>
+        <w:pStyle w:val="NormalWeb"/>
+        <w:spacing w:before="0" w:beforeAutospacing="0" w:after="0" w:afterAutospacing="0" w:line="360" w:lineRule="auto"/>
+        <w:jc w:val="both"/>
+        <w:rPr>
+          <w:sz w:val="26"/>
+          <w:szCs w:val="26"/>
+          <w:lang w:val="vi-VN"/>
+        </w:rPr>
+      </w:pPr>
+      <w:r>
+        <w:rPr>
+          <w:sz w:val="26"/>
+          <w:szCs w:val="26"/>
+          <w:lang w:val="vi-VN"/>
+        </w:rPr>
+        <w:sym w:font="Wingdings" w:char="F0E8"/>
+      </w:r>
+      <w:r>
+        <w:rPr>
+          <w:rFonts w:asciiTheme="minorHAnsi" w:eastAsiaTheme="minorHAnsi" w:hAnsiTheme="minorHAnsi" w:cstheme="minorBidi"/>
+          <w:sz w:val="22"/>
+          <w:szCs w:val="22"/>
+        </w:rPr>
+        <w:t xml:space="preserve"> </w:t>
+      </w:r>
+      <w:r>
+        <w:rPr>
+          <w:sz w:val="26"/>
+          <w:szCs w:val="26"/>
+        </w:rPr>
+        <w:t>Hai kiến trúc này không hoàn toàn đối lập.</w:t>
+      </w:r>
+    </w:p>
+    <w:p>
+      <w:pPr>
+        <w:pStyle w:val="NormalWeb"/>
+        <w:spacing w:before="0" w:beforeAutospacing="0" w:after="0" w:afterAutospacing="0" w:line="360" w:lineRule="auto"/>
+        <w:jc w:val="both"/>
+        <w:rPr>
+          <w:sz w:val="26"/>
+          <w:szCs w:val="26"/>
+          <w:lang w:val="vi-VN"/>
+        </w:rPr>
+      </w:pPr>
+      <w:r>
+        <w:rPr>
+          <w:sz w:val="26"/>
+          <w:szCs w:val="26"/>
+          <w:lang w:val="vi-VN"/>
+        </w:rPr>
+        <w:t>Một hệ thống CMS có thể chọn Microkernel ở mức tổng thể để hỗ trợ plugin extensibility, đồng thời tổ chức core và từng plugin theo Layered Architecture để dễ phát triển và bảo trì.</w:t>
       </w:r>
     </w:p>
     <w:p>
@@ -1525,7 +1673,6 @@
           <w:sz w:val="30"/>
           <w:szCs w:val="30"/>
         </w:rPr>
-        <w:lastRenderedPageBreak/>
         <w:t>Chọn style thích hợp nhất cho CMS và giải thích.</w:t>
       </w:r>
     </w:p>
@@ -1536,6 +1683,7 @@
         <w:jc w:val="both"/>
         <w:rPr>
           <w:sz w:val="26"/>
+          <w:szCs w:val="26"/>
         </w:rPr>
       </w:pPr>
       <w:r>
@@ -1543,6 +1691,7 @@
           <w:rStyle w:val="Strong"/>
           <w:b w:val="0"/>
           <w:sz w:val="26"/>
+          <w:szCs w:val="26"/>
         </w:rPr>
         <w:sym w:font="Wingdings" w:char="F0E8"/>
       </w:r>
@@ -1551,6 +1700,7 @@
           <w:rStyle w:val="Strong"/>
           <w:b w:val="0"/>
           <w:sz w:val="26"/>
+          <w:szCs w:val="26"/>
         </w:rPr>
         <w:t xml:space="preserve"> </w:t>
       </w:r>
@@ -1559,6 +1709,7 @@
           <w:rStyle w:val="Strong"/>
           <w:b w:val="0"/>
           <w:sz w:val="26"/>
+          <w:szCs w:val="26"/>
         </w:rPr>
         <w:t>Microkernel Architecture</w:t>
       </w:r>
@@ -1786,6 +1937,7 @@
         <w:rPr>
           <w:sz w:val="26"/>
           <w:szCs w:val="26"/>
+          <w:lang w:val="vi-VN"/>
         </w:rPr>
       </w:pPr>
       <w:r>
@@ -1794,6 +1946,116 @@
           <w:szCs w:val="26"/>
         </w:rPr>
         <w:t>Core chỉ cần:</w:t>
+      </w:r>
+    </w:p>
+    <w:p>
+      <w:pPr>
+        <w:pStyle w:val="NormalWeb"/>
+        <w:numPr>
+          <w:ilvl w:val="0"/>
+          <w:numId w:val="12"/>
+        </w:numPr>
+        <w:spacing w:before="0" w:beforeAutospacing="0" w:after="0" w:line="360" w:lineRule="auto"/>
+        <w:jc w:val="both"/>
+        <w:rPr>
+          <w:sz w:val="26"/>
+          <w:szCs w:val="26"/>
+        </w:rPr>
+      </w:pPr>
+      <w:r>
+        <w:rPr>
+          <w:sz w:val="26"/>
+          <w:szCs w:val="26"/>
+        </w:rPr>
+        <w:t>routing / request handlin</w:t>
+      </w:r>
+    </w:p>
+    <w:p>
+      <w:pPr>
+        <w:pStyle w:val="NormalWeb"/>
+        <w:numPr>
+          <w:ilvl w:val="0"/>
+          <w:numId w:val="12"/>
+        </w:numPr>
+        <w:spacing w:after="0" w:line="360" w:lineRule="auto"/>
+        <w:jc w:val="both"/>
+        <w:rPr>
+          <w:sz w:val="26"/>
+          <w:szCs w:val="26"/>
+        </w:rPr>
+      </w:pPr>
+      <w:r>
+        <w:rPr>
+          <w:sz w:val="26"/>
+          <w:szCs w:val="26"/>
+        </w:rPr>
+        <w:t>plugin loader</w:t>
+      </w:r>
+    </w:p>
+    <w:p>
+      <w:pPr>
+        <w:pStyle w:val="NormalWeb"/>
+        <w:numPr>
+          <w:ilvl w:val="0"/>
+          <w:numId w:val="12"/>
+        </w:numPr>
+        <w:spacing w:after="0" w:line="360" w:lineRule="auto"/>
+        <w:jc w:val="both"/>
+        <w:rPr>
+          <w:sz w:val="26"/>
+          <w:szCs w:val="26"/>
+        </w:rPr>
+      </w:pPr>
+      <w:r>
+        <w:rPr>
+          <w:sz w:val="26"/>
+          <w:szCs w:val="26"/>
+        </w:rPr>
+        <w:t>security / authentication cơ bản</w:t>
+      </w:r>
+    </w:p>
+    <w:p>
+      <w:pPr>
+        <w:pStyle w:val="NormalWeb"/>
+        <w:numPr>
+          <w:ilvl w:val="0"/>
+          <w:numId w:val="12"/>
+        </w:numPr>
+        <w:spacing w:after="0" w:line="360" w:lineRule="auto"/>
+        <w:jc w:val="both"/>
+        <w:rPr>
+          <w:sz w:val="26"/>
+          <w:szCs w:val="26"/>
+        </w:rPr>
+      </w:pPr>
+      <w:r>
+        <w:rPr>
+          <w:sz w:val="26"/>
+          <w:szCs w:val="26"/>
+        </w:rPr>
+        <w:t>configuration</w:t>
+      </w:r>
+    </w:p>
+    <w:p>
+      <w:pPr>
+        <w:pStyle w:val="NormalWeb"/>
+        <w:numPr>
+          <w:ilvl w:val="0"/>
+          <w:numId w:val="12"/>
+        </w:numPr>
+        <w:spacing w:after="0" w:line="360" w:lineRule="auto"/>
+        <w:jc w:val="both"/>
+        <w:rPr>
+          <w:sz w:val="26"/>
+          <w:szCs w:val="26"/>
+        </w:rPr>
+      </w:pPr>
+      <w:r>
+        <w:rPr>
+          <w:sz w:val="26"/>
+          <w:szCs w:val="26"/>
+        </w:rPr>
+        <w:t>content service cơ bản</w:t>
       </w:r>
     </w:p>
     <w:p>
@@ -1815,7 +2077,28 @@
           <w:sz w:val="26"/>
           <w:szCs w:val="26"/>
         </w:rPr>
-        <w:t>routing</w:t>
+        <w:lastRenderedPageBreak/>
+        <w:t>user/role management cơ bản</w:t>
+      </w:r>
+    </w:p>
+    <w:p>
+      <w:pPr>
+        <w:pStyle w:val="NormalWeb"/>
+        <w:spacing w:before="0" w:beforeAutospacing="0" w:after="0" w:afterAutospacing="0" w:line="360" w:lineRule="auto"/>
+        <w:jc w:val="both"/>
+        <w:rPr>
+          <w:sz w:val="26"/>
+          <w:szCs w:val="26"/>
+          <w:lang w:val="vi-VN"/>
+        </w:rPr>
+      </w:pPr>
+      <w:r>
+        <w:rPr>
+          <w:sz w:val="26"/>
+          <w:szCs w:val="26"/>
+          <w:lang w:val="vi-VN"/>
+        </w:rPr>
+        <w:t>Plugin nên đảm nhiệm:</w:t>
       </w:r>
     </w:p>
     <w:p>
@@ -1825,7 +2108,7 @@
           <w:ilvl w:val="0"/>
           <w:numId w:val="12"/>
         </w:numPr>
-        <w:spacing w:before="0" w:beforeAutospacing="0" w:after="0" w:afterAutospacing="0" w:line="360" w:lineRule="auto"/>
+        <w:spacing w:before="0" w:beforeAutospacing="0" w:after="0" w:line="360" w:lineRule="auto"/>
         <w:jc w:val="both"/>
         <w:rPr>
           <w:sz w:val="26"/>
@@ -1837,7 +2120,7 @@
           <w:sz w:val="26"/>
           <w:szCs w:val="26"/>
         </w:rPr>
-        <w:t>plugin loader</w:t>
+        <w:t>SEO</w:t>
       </w:r>
     </w:p>
     <w:p>
@@ -1847,7 +2130,7 @@
           <w:ilvl w:val="0"/>
           <w:numId w:val="12"/>
         </w:numPr>
-        <w:spacing w:before="0" w:beforeAutospacing="0" w:after="0" w:afterAutospacing="0" w:line="360" w:lineRule="auto"/>
+        <w:spacing w:after="0" w:line="360" w:lineRule="auto"/>
         <w:jc w:val="both"/>
         <w:rPr>
           <w:sz w:val="26"/>
@@ -1859,7 +2142,7 @@
           <w:sz w:val="26"/>
           <w:szCs w:val="26"/>
         </w:rPr>
-        <w:t>security</w:t>
+        <w:t>analytics</w:t>
       </w:r>
     </w:p>
     <w:p>
@@ -1869,7 +2152,7 @@
           <w:ilvl w:val="0"/>
           <w:numId w:val="12"/>
         </w:numPr>
-        <w:spacing w:before="0" w:beforeAutospacing="0" w:after="0" w:afterAutospacing="0" w:line="360" w:lineRule="auto"/>
+        <w:spacing w:after="0" w:line="360" w:lineRule="auto"/>
         <w:jc w:val="both"/>
         <w:rPr>
           <w:sz w:val="26"/>
@@ -1881,13 +2164,17 @@
           <w:sz w:val="26"/>
           <w:szCs w:val="26"/>
         </w:rPr>
-        <w:t>configuration</w:t>
+        <w:t>workflow</w:t>
       </w:r>
     </w:p>
     <w:p>
       <w:pPr>
         <w:pStyle w:val="NormalWeb"/>
-        <w:spacing w:before="0" w:beforeAutospacing="0" w:after="0" w:afterAutospacing="0" w:line="360" w:lineRule="auto"/>
+        <w:numPr>
+          <w:ilvl w:val="0"/>
+          <w:numId w:val="12"/>
+        </w:numPr>
+        <w:spacing w:after="0" w:line="360" w:lineRule="auto"/>
         <w:jc w:val="both"/>
         <w:rPr>
           <w:sz w:val="26"/>
@@ -1899,21 +2186,73 @@
           <w:sz w:val="26"/>
           <w:szCs w:val="26"/>
         </w:rPr>
-        <w:t xml:space="preserve">Mọi chức năng khác </w:t>
-      </w:r>
-      <w:r>
-        <w:rPr>
-          <w:sz w:val="26"/>
-          <w:szCs w:val="26"/>
-        </w:rPr>
-        <w:sym w:font="Wingdings" w:char="F0E0"/>
-      </w:r>
-      <w:r>
-        <w:rPr>
-          <w:sz w:val="26"/>
-          <w:szCs w:val="26"/>
-        </w:rPr>
-        <w:t xml:space="preserve"> plugin.</w:t>
+        <w:t>page builder</w:t>
+      </w:r>
+    </w:p>
+    <w:p>
+      <w:pPr>
+        <w:pStyle w:val="NormalWeb"/>
+        <w:numPr>
+          <w:ilvl w:val="0"/>
+          <w:numId w:val="12"/>
+        </w:numPr>
+        <w:spacing w:after="0" w:line="360" w:lineRule="auto"/>
+        <w:jc w:val="both"/>
+        <w:rPr>
+          <w:sz w:val="26"/>
+          <w:szCs w:val="26"/>
+        </w:rPr>
+      </w:pPr>
+      <w:r>
+        <w:rPr>
+          <w:sz w:val="26"/>
+          <w:szCs w:val="26"/>
+        </w:rPr>
+        <w:t>cache</w:t>
+      </w:r>
+    </w:p>
+    <w:p>
+      <w:pPr>
+        <w:pStyle w:val="NormalWeb"/>
+        <w:numPr>
+          <w:ilvl w:val="0"/>
+          <w:numId w:val="12"/>
+        </w:numPr>
+        <w:spacing w:after="0" w:line="360" w:lineRule="auto"/>
+        <w:jc w:val="both"/>
+        <w:rPr>
+          <w:sz w:val="26"/>
+          <w:szCs w:val="26"/>
+        </w:rPr>
+      </w:pPr>
+      <w:r>
+        <w:rPr>
+          <w:sz w:val="26"/>
+          <w:szCs w:val="26"/>
+        </w:rPr>
+        <w:t>custom fields</w:t>
+      </w:r>
+    </w:p>
+    <w:p>
+      <w:pPr>
+        <w:pStyle w:val="NormalWeb"/>
+        <w:numPr>
+          <w:ilvl w:val="0"/>
+          <w:numId w:val="12"/>
+        </w:numPr>
+        <w:spacing w:after="0" w:line="360" w:lineRule="auto"/>
+        <w:jc w:val="both"/>
+        <w:rPr>
+          <w:sz w:val="26"/>
+          <w:szCs w:val="26"/>
+        </w:rPr>
+      </w:pPr>
+      <w:r>
+        <w:rPr>
+          <w:sz w:val="26"/>
+          <w:szCs w:val="26"/>
+        </w:rPr>
+        <w:t>integrations</w:t>
       </w:r>
     </w:p>
     <w:p>
@@ -1932,12 +2271,11 @@
       </w:pPr>
       <w:r>
         <w:rPr>
-          <w:rStyle w:val="Strong"/>
-          <w:b w:val="0"/>
-          <w:sz w:val="26"/>
-          <w:szCs w:val="26"/>
-        </w:rPr>
-        <w:t>Thực tế các CMS lớn đều dùng plugin architecture</w:t>
+          <w:bCs/>
+          <w:sz w:val="26"/>
+          <w:szCs w:val="26"/>
+        </w:rPr>
+        <w:t>Nhiều CMS lớn áp dụng kiến trúc module/plugin để hỗ trợ mở rộng tính năng.</w:t>
       </w:r>
     </w:p>
     <w:p>
@@ -2075,8 +2413,8 @@
 </file>
 
 <file path=word/numbering.xml><?xml version="1.0" encoding="utf-8"?>
-<w:numbering xmlns:wpc="http://schemas.microsoft.com/office/word/2010/wordprocessingCanvas" xmlns:mc="http://schemas.openxmlformats.org/markup-compatibility/2006" xmlns:o="urn:schemas-microsoft-com:office:office" xmlns:r="http://schemas.openxmlformats.org/officeDocument/2006/relationships" xmlns:m="http://schemas.openxmlformats.org/officeDocument/2006/math" xmlns:v="urn:schemas-microsoft-com:vml" xmlns:wp14="http://schemas.microsoft.com/office/word/2010/wordprocessingDrawing" xmlns:wp="http://schemas.openxmlformats.org/drawingml/2006/wordprocessingDrawing" xmlns:w10="urn:schemas-microsoft-com:office:word" xmlns:w="http://schemas.openxmlformats.org/wordprocessingml/2006/main" xmlns:w14="http://schemas.microsoft.com/office/word/2010/wordml" xmlns:w15="http://schemas.microsoft.com/office/word/2012/wordml" xmlns:wpg="http://schemas.microsoft.com/office/word/2010/wordprocessingGroup" xmlns:wpi="http://schemas.microsoft.com/office/word/2010/wordprocessingInk" xmlns:wne="http://schemas.microsoft.com/office/word/2006/wordml" xmlns:wps="http://schemas.microsoft.com/office/word/2010/wordprocessingShape" mc:Ignorable="w14 w15 wp14">
-  <w:abstractNum w:abstractNumId="0">
+<w:numbering xmlns:wpc="http://schemas.microsoft.com/office/word/2010/wordprocessingCanvas" xmlns:cx="http://schemas.microsoft.com/office/drawing/2014/chartex" xmlns:cx1="http://schemas.microsoft.com/office/drawing/2015/9/8/chartex" xmlns:cx2="http://schemas.microsoft.com/office/drawing/2015/10/21/chartex" xmlns:cx3="http://schemas.microsoft.com/office/drawing/2016/5/9/chartex" xmlns:cx4="http://schemas.microsoft.com/office/drawing/2016/5/10/chartex" xmlns:cx5="http://schemas.microsoft.com/office/drawing/2016/5/11/chartex" xmlns:cx6="http://schemas.microsoft.com/office/drawing/2016/5/12/chartex" xmlns:cx7="http://schemas.microsoft.com/office/drawing/2016/5/13/chartex" xmlns:cx8="http://schemas.microsoft.com/office/drawing/2016/5/14/chartex" xmlns:mc="http://schemas.openxmlformats.org/markup-compatibility/2006" xmlns:aink="http://schemas.microsoft.com/office/drawing/2016/ink" xmlns:am3d="http://schemas.microsoft.com/office/drawing/2017/model3d" xmlns:o="urn:schemas-microsoft-com:office:office" xmlns:oel="http://schemas.microsoft.com/office/2019/extlst" xmlns:r="http://schemas.openxmlformats.org/officeDocument/2006/relationships" xmlns:m="http://schemas.openxmlformats.org/officeDocument/2006/math" xmlns:v="urn:schemas-microsoft-com:vml" xmlns:wp14="http://schemas.microsoft.com/office/word/2010/wordprocessingDrawing" xmlns:wp="http://schemas.openxmlformats.org/drawingml/2006/wordprocessingDrawing" xmlns:w10="urn:schemas-microsoft-com:office:word" xmlns:w="http://schemas.openxmlformats.org/wordprocessingml/2006/main" xmlns:w14="http://schemas.microsoft.com/office/word/2010/wordml" xmlns:w15="http://schemas.microsoft.com/office/word/2012/wordml" xmlns:w16cex="http://schemas.microsoft.com/office/word/2018/wordml/cex" xmlns:w16cid="http://schemas.microsoft.com/office/word/2016/wordml/cid" xmlns:w16="http://schemas.microsoft.com/office/word/2018/wordml" xmlns:w16du="http://schemas.microsoft.com/office/word/2023/wordml/word16du" xmlns:w16sdtdh="http://schemas.microsoft.com/office/word/2020/wordml/sdtdatahash" xmlns:w16sdtfl="http://schemas.microsoft.com/office/word/2024/wordml/sdtformatlock" xmlns:w16se="http://schemas.microsoft.com/office/word/2015/wordml/symex" xmlns:wpg="http://schemas.microsoft.com/office/word/2010/wordprocessingGroup" xmlns:wpi="http://schemas.microsoft.com/office/word/2010/wordprocessingInk" xmlns:wne="http://schemas.microsoft.com/office/word/2006/wordml" xmlns:wps="http://schemas.microsoft.com/office/word/2010/wordprocessingShape" mc:Ignorable="w14 w15 w16se w16cid w16 w16cex w16sdtdh w16sdtfl w16du wp14">
+  <w:abstractNum w:abstractNumId="0" w15:restartNumberingAfterBreak="0">
     <w:nsid w:val="030C1BC8"/>
     <w:multiLevelType w:val="hybridMultilevel"/>
     <w:tmpl w:val="88E65108"/>
@@ -2189,7 +2527,7 @@
       </w:rPr>
     </w:lvl>
   </w:abstractNum>
-  <w:abstractNum w:abstractNumId="1">
+  <w:abstractNum w:abstractNumId="1" w15:restartNumberingAfterBreak="0">
     <w:nsid w:val="06B56EF3"/>
     <w:multiLevelType w:val="multilevel"/>
     <w:tmpl w:val="04348274"/>
@@ -2338,7 +2676,7 @@
       </w:rPr>
     </w:lvl>
   </w:abstractNum>
-  <w:abstractNum w:abstractNumId="2">
+  <w:abstractNum w:abstractNumId="2" w15:restartNumberingAfterBreak="0">
     <w:nsid w:val="125C0671"/>
     <w:multiLevelType w:val="multilevel"/>
     <w:tmpl w:val="8EAAB6A6"/>
@@ -2451,7 +2789,7 @@
       </w:pPr>
     </w:lvl>
   </w:abstractNum>
-  <w:abstractNum w:abstractNumId="3">
+  <w:abstractNum w:abstractNumId="3" w15:restartNumberingAfterBreak="0">
     <w:nsid w:val="160F60F6"/>
     <w:multiLevelType w:val="multilevel"/>
     <w:tmpl w:val="16C011F8"/>
@@ -2600,7 +2938,7 @@
       </w:rPr>
     </w:lvl>
   </w:abstractNum>
-  <w:abstractNum w:abstractNumId="4">
+  <w:abstractNum w:abstractNumId="4" w15:restartNumberingAfterBreak="0">
     <w:nsid w:val="172B0494"/>
     <w:multiLevelType w:val="hybridMultilevel"/>
     <w:tmpl w:val="71AC63D2"/>
@@ -2713,7 +3051,7 @@
       </w:rPr>
     </w:lvl>
   </w:abstractNum>
-  <w:abstractNum w:abstractNumId="5">
+  <w:abstractNum w:abstractNumId="5" w15:restartNumberingAfterBreak="0">
     <w:nsid w:val="1E8B007E"/>
     <w:multiLevelType w:val="multilevel"/>
     <w:tmpl w:val="133C336E"/>
@@ -2826,7 +3164,7 @@
       </w:pPr>
     </w:lvl>
   </w:abstractNum>
-  <w:abstractNum w:abstractNumId="6">
+  <w:abstractNum w:abstractNumId="6" w15:restartNumberingAfterBreak="0">
     <w:nsid w:val="25D878D6"/>
     <w:multiLevelType w:val="multilevel"/>
     <w:tmpl w:val="13DC3038"/>
@@ -2975,7 +3313,7 @@
       </w:rPr>
     </w:lvl>
   </w:abstractNum>
-  <w:abstractNum w:abstractNumId="7">
+  <w:abstractNum w:abstractNumId="7" w15:restartNumberingAfterBreak="0">
     <w:nsid w:val="2CE21882"/>
     <w:multiLevelType w:val="multilevel"/>
     <w:tmpl w:val="EE803872"/>
@@ -3124,7 +3462,7 @@
       </w:rPr>
     </w:lvl>
   </w:abstractNum>
-  <w:abstractNum w:abstractNumId="8">
+  <w:abstractNum w:abstractNumId="8" w15:restartNumberingAfterBreak="0">
     <w:nsid w:val="33E75539"/>
     <w:multiLevelType w:val="hybridMultilevel"/>
     <w:tmpl w:val="32C080EA"/>
@@ -3213,7 +3551,7 @@
       </w:pPr>
     </w:lvl>
   </w:abstractNum>
-  <w:abstractNum w:abstractNumId="9">
+  <w:abstractNum w:abstractNumId="9" w15:restartNumberingAfterBreak="0">
     <w:nsid w:val="44B05E73"/>
     <w:multiLevelType w:val="multilevel"/>
     <w:tmpl w:val="67D6DC5A"/>
@@ -3362,7 +3700,7 @@
       </w:rPr>
     </w:lvl>
   </w:abstractNum>
-  <w:abstractNum w:abstractNumId="10">
+  <w:abstractNum w:abstractNumId="10" w15:restartNumberingAfterBreak="0">
     <w:nsid w:val="581E3575"/>
     <w:multiLevelType w:val="multilevel"/>
     <w:tmpl w:val="FF6805EE"/>
@@ -3511,7 +3849,7 @@
       </w:rPr>
     </w:lvl>
   </w:abstractNum>
-  <w:abstractNum w:abstractNumId="11">
+  <w:abstractNum w:abstractNumId="11" w15:restartNumberingAfterBreak="0">
     <w:nsid w:val="59554D73"/>
     <w:multiLevelType w:val="hybridMultilevel"/>
     <w:tmpl w:val="23387F48"/>
@@ -3624,7 +3962,7 @@
       </w:rPr>
     </w:lvl>
   </w:abstractNum>
-  <w:abstractNum w:abstractNumId="12">
+  <w:abstractNum w:abstractNumId="12" w15:restartNumberingAfterBreak="0">
     <w:nsid w:val="5BEB0A1E"/>
     <w:multiLevelType w:val="multilevel"/>
     <w:tmpl w:val="8AF68CE8"/>
@@ -3737,7 +4075,7 @@
       </w:pPr>
     </w:lvl>
   </w:abstractNum>
-  <w:abstractNum w:abstractNumId="13">
+  <w:abstractNum w:abstractNumId="13" w15:restartNumberingAfterBreak="0">
     <w:nsid w:val="5CFB6059"/>
     <w:multiLevelType w:val="hybridMultilevel"/>
     <w:tmpl w:val="AC5499EA"/>
@@ -3850,7 +4188,7 @@
       </w:rPr>
     </w:lvl>
   </w:abstractNum>
-  <w:abstractNum w:abstractNumId="14">
+  <w:abstractNum w:abstractNumId="14" w15:restartNumberingAfterBreak="0">
     <w:nsid w:val="69843665"/>
     <w:multiLevelType w:val="multilevel"/>
     <w:tmpl w:val="29B42EF8"/>
@@ -3999,7 +4337,7 @@
       </w:rPr>
     </w:lvl>
   </w:abstractNum>
-  <w:abstractNum w:abstractNumId="15">
+  <w:abstractNum w:abstractNumId="15" w15:restartNumberingAfterBreak="0">
     <w:nsid w:val="706B0E10"/>
     <w:multiLevelType w:val="multilevel"/>
     <w:tmpl w:val="F56496DE"/>
@@ -4148,7 +4486,7 @@
       </w:rPr>
     </w:lvl>
   </w:abstractNum>
-  <w:abstractNum w:abstractNumId="16">
+  <w:abstractNum w:abstractNumId="16" w15:restartNumberingAfterBreak="0">
     <w:nsid w:val="72561584"/>
     <w:multiLevelType w:val="multilevel"/>
     <w:tmpl w:val="43A22474"/>
@@ -4261,62 +4599,62 @@
       </w:pPr>
     </w:lvl>
   </w:abstractNum>
-  <w:num w:numId="1">
+  <w:num w:numId="1" w16cid:durableId="7366357">
     <w:abstractNumId w:val="2"/>
   </w:num>
-  <w:num w:numId="2">
+  <w:num w:numId="2" w16cid:durableId="764113696">
     <w:abstractNumId w:val="11"/>
   </w:num>
-  <w:num w:numId="3">
+  <w:num w:numId="3" w16cid:durableId="107820366">
     <w:abstractNumId w:val="15"/>
   </w:num>
-  <w:num w:numId="4">
+  <w:num w:numId="4" w16cid:durableId="1501584990">
     <w:abstractNumId w:val="10"/>
   </w:num>
-  <w:num w:numId="5">
+  <w:num w:numId="5" w16cid:durableId="1097556810">
     <w:abstractNumId w:val="0"/>
   </w:num>
-  <w:num w:numId="6">
+  <w:num w:numId="6" w16cid:durableId="2013023968">
     <w:abstractNumId w:val="9"/>
   </w:num>
-  <w:num w:numId="7">
+  <w:num w:numId="7" w16cid:durableId="500970400">
     <w:abstractNumId w:val="3"/>
   </w:num>
-  <w:num w:numId="8">
+  <w:num w:numId="8" w16cid:durableId="187960673">
     <w:abstractNumId w:val="13"/>
   </w:num>
-  <w:num w:numId="9">
+  <w:num w:numId="9" w16cid:durableId="511721961">
     <w:abstractNumId w:val="5"/>
   </w:num>
-  <w:num w:numId="10">
+  <w:num w:numId="10" w16cid:durableId="424304669">
     <w:abstractNumId w:val="7"/>
   </w:num>
-  <w:num w:numId="11">
+  <w:num w:numId="11" w16cid:durableId="1155217662">
     <w:abstractNumId w:val="16"/>
   </w:num>
-  <w:num w:numId="12">
+  <w:num w:numId="12" w16cid:durableId="79373426">
     <w:abstractNumId w:val="14"/>
   </w:num>
-  <w:num w:numId="13">
+  <w:num w:numId="13" w16cid:durableId="462506338">
     <w:abstractNumId w:val="12"/>
   </w:num>
-  <w:num w:numId="14">
+  <w:num w:numId="14" w16cid:durableId="1614551547">
     <w:abstractNumId w:val="1"/>
   </w:num>
-  <w:num w:numId="15">
+  <w:num w:numId="15" w16cid:durableId="1146511733">
     <w:abstractNumId w:val="8"/>
   </w:num>
-  <w:num w:numId="16">
+  <w:num w:numId="16" w16cid:durableId="1126312323">
     <w:abstractNumId w:val="4"/>
   </w:num>
-  <w:num w:numId="17">
+  <w:num w:numId="17" w16cid:durableId="74132125">
     <w:abstractNumId w:val="6"/>
   </w:num>
 </w:numbering>
 </file>
 
 <file path=word/styles.xml><?xml version="1.0" encoding="utf-8"?>
-<w:styles xmlns:mc="http://schemas.openxmlformats.org/markup-compatibility/2006" xmlns:r="http://schemas.openxmlformats.org/officeDocument/2006/relationships" xmlns:w="http://schemas.openxmlformats.org/wordprocessingml/2006/main" xmlns:w14="http://schemas.microsoft.com/office/word/2010/wordml" xmlns:w15="http://schemas.microsoft.com/office/word/2012/wordml" mc:Ignorable="w14 w15">
+<w:styles xmlns:mc="http://schemas.openxmlformats.org/markup-compatibility/2006" xmlns:r="http://schemas.openxmlformats.org/officeDocument/2006/relationships" xmlns:w="http://schemas.openxmlformats.org/wordprocessingml/2006/main" xmlns:w14="http://schemas.microsoft.com/office/word/2010/wordml" xmlns:w15="http://schemas.microsoft.com/office/word/2012/wordml" xmlns:w16cex="http://schemas.microsoft.com/office/word/2018/wordml/cex" xmlns:w16cid="http://schemas.microsoft.com/office/word/2016/wordml/cid" xmlns:w16="http://schemas.microsoft.com/office/word/2018/wordml" xmlns:w16du="http://schemas.microsoft.com/office/word/2023/wordml/word16du" xmlns:w16sdtdh="http://schemas.microsoft.com/office/word/2020/wordml/sdtdatahash" xmlns:w16sdtfl="http://schemas.microsoft.com/office/word/2024/wordml/sdtformatlock" xmlns:w16se="http://schemas.microsoft.com/office/word/2015/wordml/symex" mc:Ignorable="w14 w15 w16se w16cid w16 w16cex w16sdtdh w16sdtfl w16du">
   <w:docDefaults>
     <w:rPrDefault>
       <w:rPr>
@@ -4332,7 +4670,7 @@
       </w:pPr>
     </w:pPrDefault>
   </w:docDefaults>
-  <w:latentStyles w:defLockedState="0" w:defUIPriority="99" w:defSemiHidden="0" w:defUnhideWhenUsed="0" w:defQFormat="0" w:count="371">
+  <w:latentStyles w:defLockedState="0" w:defUIPriority="99" w:defSemiHidden="0" w:defUnhideWhenUsed="0" w:defQFormat="0" w:count="376">
     <w:lsdException w:name="Normal" w:uiPriority="0" w:qFormat="1"/>
     <w:lsdException w:name="heading 1" w:uiPriority="9" w:qFormat="1"/>
     <w:lsdException w:name="heading 2" w:semiHidden="1" w:uiPriority="9" w:unhideWhenUsed="1" w:qFormat="1"/>
@@ -4704,6 +5042,11 @@
     <w:lsdException w:name="List Table 5 Dark Accent 6" w:uiPriority="50"/>
     <w:lsdException w:name="List Table 6 Colorful Accent 6" w:uiPriority="51"/>
     <w:lsdException w:name="List Table 7 Colorful Accent 6" w:uiPriority="52"/>
+    <w:lsdException w:name="Mention" w:semiHidden="1" w:unhideWhenUsed="1"/>
+    <w:lsdException w:name="Smart Hyperlink" w:semiHidden="1" w:unhideWhenUsed="1"/>
+    <w:lsdException w:name="Hashtag" w:semiHidden="1" w:unhideWhenUsed="1"/>
+    <w:lsdException w:name="Unresolved Mention" w:semiHidden="1" w:unhideWhenUsed="1"/>
+    <w:lsdException w:name="Smart Link" w:semiHidden="1" w:unhideWhenUsed="1"/>
   </w:latentStyles>
   <w:style w:type="paragraph" w:default="1" w:styleId="Normal">
     <w:name w:val="Normal"/>
@@ -4797,7 +5140,6 @@
   <w:style w:type="character" w:default="1" w:styleId="DefaultParagraphFont">
     <w:name w:val="Default Paragraph Font"/>
     <w:uiPriority w:val="1"/>
-    <w:semiHidden/>
     <w:unhideWhenUsed/>
   </w:style>
   <w:style w:type="table" w:default="1" w:styleId="TableNormal">

</xml_diff>